<commit_message>
Iteration 3 Group Submission
</commit_message>
<xml_diff>
--- a/doc/CS673_SPPP_team2.docx
+++ b/doc/CS673_SPPP_team2.docx
@@ -181,12 +181,12 @@
           <wp:inline distB="114300" distT="114300" distL="114300" distR="114300">
             <wp:extent cx="2467655" cy="442913"/>
             <wp:effectExtent b="0" l="0" r="0" t="0"/>
-            <wp:docPr id="1" name="image1.png"/>
+            <wp:docPr id="1" name="image6.png"/>
             <a:graphic>
               <a:graphicData uri="http://schemas.openxmlformats.org/drawingml/2006/picture">
                 <pic:pic>
                   <pic:nvPicPr>
-                    <pic:cNvPr id="0" name="image1.png"/>
+                    <pic:cNvPr id="0" name="image6.png"/>
                     <pic:cNvPicPr preferRelativeResize="0"/>
                   </pic:nvPicPr>
                   <pic:blipFill>
@@ -3895,12 +3895,9 @@
           <w:between w:space="0" w:sz="0" w:val="nil"/>
         </w:pBdr>
         <w:shd w:fill="auto" w:val="clear"/>
-        <w:ind w:left="360" w:firstLine="0"/>
+        <w:ind w:left="0" w:firstLine="0"/>
         <w:rPr/>
       </w:pPr>
-      <w:r>
-        <w:br w:type="page"/>
-      </w:r>
       <w:r>
         <w:rPr>
           <w:rtl w:val="0"/>
@@ -3909,6 +3906,7 @@
     </w:p>
     <w:sdt>
       <w:sdtPr>
+        <w:id w:val="-2123228424"/>
         <w:docPartObj>
           <w:docPartGallery w:val="Table of Contents"/>
           <w:docPartUnique w:val="1"/>
@@ -3977,6 +3975,7 @@
     </w:p>
     <w:sdt>
       <w:sdtPr>
+        <w:id w:val="-1864040843"/>
         <w:docPartObj>
           <w:docPartGallery w:val="Table of Contents"/>
           <w:docPartUnique w:val="1"/>
@@ -10849,12 +10848,405 @@
               <w:pageBreakBefore w:val="0"/>
               <w:widowControl w:val="0"/>
               <w:spacing w:line="240" w:lineRule="auto"/>
-              <w:rPr/>
-            </w:pPr>
-            <w:r>
-              <w:rPr>
-                <w:rtl w:val="0"/>
-              </w:rPr>
+              <w:rPr>
+                <w:b w:val="1"/>
+              </w:rPr>
+            </w:pPr>
+            <w:r>
+              <w:rPr>
+                <w:b w:val="1"/>
+                <w:rtl w:val="0"/>
+              </w:rPr>
+              <w:t xml:space="preserve">My Stories:</w:t>
+            </w:r>
+          </w:p>
+          <w:p>
+            <w:pPr>
+              <w:pageBreakBefore w:val="0"/>
+              <w:widowControl w:val="0"/>
+              <w:spacing w:line="240" w:lineRule="auto"/>
+              <w:rPr/>
+            </w:pPr>
+            <w:r>
+              <w:rPr>
+                <w:rtl w:val="0"/>
+              </w:rPr>
+              <w:t xml:space="preserve">Implement functionality to save a generated story and show confirmation</w:t>
+            </w:r>
+          </w:p>
+          <w:p>
+            <w:pPr>
+              <w:pageBreakBefore w:val="0"/>
+              <w:widowControl w:val="0"/>
+              <w:spacing w:line="240" w:lineRule="auto"/>
+              <w:rPr/>
+            </w:pPr>
+            <w:r>
+              <w:rPr>
+                <w:rtl w:val="0"/>
+              </w:rPr>
+            </w:r>
+          </w:p>
+          <w:p>
+            <w:pPr>
+              <w:pageBreakBefore w:val="0"/>
+              <w:widowControl w:val="0"/>
+              <w:spacing w:line="240" w:lineRule="auto"/>
+              <w:rPr/>
+            </w:pPr>
+            <w:r>
+              <w:rPr>
+                <w:rtl w:val="0"/>
+              </w:rPr>
+              <w:t xml:space="preserve">Develop story retrieval via API, supporting full details and filtering by attributes</w:t>
+            </w:r>
+          </w:p>
+          <w:p>
+            <w:pPr>
+              <w:pageBreakBefore w:val="0"/>
+              <w:widowControl w:val="0"/>
+              <w:spacing w:line="240" w:lineRule="auto"/>
+              <w:rPr/>
+            </w:pPr>
+            <w:r>
+              <w:rPr>
+                <w:rtl w:val="0"/>
+              </w:rPr>
+            </w:r>
+          </w:p>
+          <w:p>
+            <w:pPr>
+              <w:pageBreakBefore w:val="0"/>
+              <w:widowControl w:val="0"/>
+              <w:spacing w:line="240" w:lineRule="auto"/>
+              <w:rPr/>
+            </w:pPr>
+            <w:r>
+              <w:rPr>
+                <w:rtl w:val="0"/>
+              </w:rPr>
+              <w:t xml:space="preserve">Build filtering system to sort/search saved stories by theme, character or setting</w:t>
+            </w:r>
+          </w:p>
+          <w:p>
+            <w:pPr>
+              <w:pageBreakBefore w:val="0"/>
+              <w:widowControl w:val="0"/>
+              <w:spacing w:line="240" w:lineRule="auto"/>
+              <w:rPr/>
+            </w:pPr>
+            <w:r>
+              <w:rPr>
+                <w:rtl w:val="0"/>
+              </w:rPr>
+            </w:r>
+          </w:p>
+          <w:p>
+            <w:pPr>
+              <w:pageBreakBefore w:val="0"/>
+              <w:widowControl w:val="0"/>
+              <w:spacing w:line="240" w:lineRule="auto"/>
+              <w:rPr/>
+            </w:pPr>
+            <w:r>
+              <w:rPr>
+                <w:rtl w:val="0"/>
+              </w:rPr>
+              <w:t xml:space="preserve">Add pagination for browsing saved stories with options for page size and navigation</w:t>
+            </w:r>
+          </w:p>
+          <w:p>
+            <w:pPr>
+              <w:pageBreakBefore w:val="0"/>
+              <w:widowControl w:val="0"/>
+              <w:spacing w:line="240" w:lineRule="auto"/>
+              <w:rPr/>
+            </w:pPr>
+            <w:r>
+              <w:rPr>
+                <w:rtl w:val="0"/>
+              </w:rPr>
+            </w:r>
+          </w:p>
+          <w:p>
+            <w:pPr>
+              <w:pageBreakBefore w:val="0"/>
+              <w:widowControl w:val="0"/>
+              <w:spacing w:line="240" w:lineRule="auto"/>
+              <w:rPr/>
+            </w:pPr>
+            <w:r>
+              <w:rPr>
+                <w:rtl w:val="0"/>
+              </w:rPr>
+              <w:t xml:space="preserve">Implement deletion of individual stories using API with success and error handling</w:t>
+            </w:r>
+          </w:p>
+          <w:p>
+            <w:pPr>
+              <w:pageBreakBefore w:val="0"/>
+              <w:widowControl w:val="0"/>
+              <w:spacing w:line="240" w:lineRule="auto"/>
+              <w:rPr/>
+            </w:pPr>
+            <w:r>
+              <w:rPr>
+                <w:rtl w:val="0"/>
+              </w:rPr>
+            </w:r>
+          </w:p>
+          <w:p>
+            <w:pPr>
+              <w:pageBreakBefore w:val="0"/>
+              <w:widowControl w:val="0"/>
+              <w:spacing w:line="240" w:lineRule="auto"/>
+              <w:rPr>
+                <w:b w:val="1"/>
+              </w:rPr>
+            </w:pPr>
+            <w:r>
+              <w:rPr>
+                <w:b w:val="1"/>
+                <w:rtl w:val="0"/>
+              </w:rPr>
+              <w:t xml:space="preserve">Testing:</w:t>
+            </w:r>
+          </w:p>
+          <w:p>
+            <w:pPr>
+              <w:pageBreakBefore w:val="0"/>
+              <w:widowControl w:val="0"/>
+              <w:spacing w:line="240" w:lineRule="auto"/>
+              <w:rPr/>
+            </w:pPr>
+            <w:r>
+              <w:rPr>
+                <w:rtl w:val="0"/>
+              </w:rPr>
+              <w:t xml:space="preserve">Validate saving, retrieving, filtering, paginating and deleting stories for correctness</w:t>
+            </w:r>
+          </w:p>
+          <w:p>
+            <w:pPr>
+              <w:pageBreakBefore w:val="0"/>
+              <w:widowControl w:val="0"/>
+              <w:spacing w:line="240" w:lineRule="auto"/>
+              <w:rPr/>
+            </w:pPr>
+            <w:r>
+              <w:rPr>
+                <w:rtl w:val="0"/>
+              </w:rPr>
+            </w:r>
+          </w:p>
+          <w:p>
+            <w:pPr>
+              <w:pageBreakBefore w:val="0"/>
+              <w:widowControl w:val="0"/>
+              <w:spacing w:line="240" w:lineRule="auto"/>
+              <w:rPr>
+                <w:b w:val="1"/>
+              </w:rPr>
+            </w:pPr>
+            <w:r>
+              <w:rPr>
+                <w:b w:val="1"/>
+                <w:rtl w:val="0"/>
+              </w:rPr>
+              <w:t xml:space="preserve">Dashboard:</w:t>
+            </w:r>
+          </w:p>
+          <w:p>
+            <w:pPr>
+              <w:pageBreakBefore w:val="0"/>
+              <w:widowControl w:val="0"/>
+              <w:spacing w:line="240" w:lineRule="auto"/>
+              <w:rPr/>
+            </w:pPr>
+            <w:r>
+              <w:rPr>
+                <w:rtl w:val="0"/>
+              </w:rPr>
+              <w:t xml:space="preserve">Implement voice selection UI with limited model options</w:t>
+            </w:r>
+          </w:p>
+          <w:p>
+            <w:pPr>
+              <w:pageBreakBefore w:val="0"/>
+              <w:widowControl w:val="0"/>
+              <w:spacing w:line="240" w:lineRule="auto"/>
+              <w:rPr/>
+            </w:pPr>
+            <w:r>
+              <w:rPr>
+                <w:rtl w:val="0"/>
+              </w:rPr>
+            </w:r>
+          </w:p>
+          <w:p>
+            <w:pPr>
+              <w:pageBreakBefore w:val="0"/>
+              <w:widowControl w:val="0"/>
+              <w:spacing w:line="240" w:lineRule="auto"/>
+              <w:rPr/>
+            </w:pPr>
+            <w:r>
+              <w:rPr>
+                <w:rtl w:val="0"/>
+              </w:rPr>
+              <w:t xml:space="preserve">Allow selection of text-to-speech model types</w:t>
+            </w:r>
+          </w:p>
+          <w:p>
+            <w:pPr>
+              <w:pageBreakBefore w:val="0"/>
+              <w:widowControl w:val="0"/>
+              <w:spacing w:line="240" w:lineRule="auto"/>
+              <w:rPr/>
+            </w:pPr>
+            <w:r>
+              <w:rPr>
+                <w:rtl w:val="0"/>
+              </w:rPr>
+            </w:r>
+          </w:p>
+          <w:p>
+            <w:pPr>
+              <w:pageBreakBefore w:val="0"/>
+              <w:widowControl w:val="0"/>
+              <w:spacing w:line="240" w:lineRule="auto"/>
+              <w:rPr/>
+            </w:pPr>
+            <w:r>
+              <w:rPr>
+                <w:rtl w:val="0"/>
+              </w:rPr>
+              <w:t xml:space="preserve">Build a dropdown or input for selecting image generation</w:t>
+            </w:r>
+          </w:p>
+          <w:p>
+            <w:pPr>
+              <w:pageBreakBefore w:val="0"/>
+              <w:widowControl w:val="0"/>
+              <w:spacing w:line="240" w:lineRule="auto"/>
+              <w:rPr/>
+            </w:pPr>
+            <w:r>
+              <w:rPr>
+                <w:rtl w:val="0"/>
+              </w:rPr>
+            </w:r>
+          </w:p>
+          <w:p>
+            <w:pPr>
+              <w:pageBreakBefore w:val="0"/>
+              <w:widowControl w:val="0"/>
+              <w:spacing w:line="240" w:lineRule="auto"/>
+              <w:rPr/>
+            </w:pPr>
+            <w:r>
+              <w:rPr>
+                <w:rtl w:val="0"/>
+              </w:rPr>
+              <w:t xml:space="preserve">Enable word count with adjustable range</w:t>
+            </w:r>
+          </w:p>
+          <w:p>
+            <w:pPr>
+              <w:pageBreakBefore w:val="0"/>
+              <w:widowControl w:val="0"/>
+              <w:spacing w:line="240" w:lineRule="auto"/>
+              <w:rPr/>
+            </w:pPr>
+            <w:r>
+              <w:rPr>
+                <w:rtl w:val="0"/>
+              </w:rPr>
+            </w:r>
+          </w:p>
+          <w:p>
+            <w:pPr>
+              <w:pageBreakBefore w:val="0"/>
+              <w:widowControl w:val="0"/>
+              <w:spacing w:line="240" w:lineRule="auto"/>
+              <w:rPr/>
+            </w:pPr>
+            <w:r>
+              <w:rPr>
+                <w:rtl w:val="0"/>
+              </w:rPr>
+              <w:t xml:space="preserve">Add options to configure appropriate story themes</w:t>
+            </w:r>
+          </w:p>
+          <w:p>
+            <w:pPr>
+              <w:pageBreakBefore w:val="0"/>
+              <w:widowControl w:val="0"/>
+              <w:spacing w:line="240" w:lineRule="auto"/>
+              <w:rPr/>
+            </w:pPr>
+            <w:r>
+              <w:rPr>
+                <w:rtl w:val="0"/>
+              </w:rPr>
+            </w:r>
+          </w:p>
+          <w:p>
+            <w:pPr>
+              <w:pageBreakBefore w:val="0"/>
+              <w:widowControl w:val="0"/>
+              <w:spacing w:line="240" w:lineRule="auto"/>
+              <w:rPr/>
+            </w:pPr>
+            <w:r>
+              <w:rPr>
+                <w:rtl w:val="0"/>
+              </w:rPr>
+              <w:t xml:space="preserve">Require parent authentication to save or update generation settings</w:t>
+            </w:r>
+          </w:p>
+          <w:p>
+            <w:pPr>
+              <w:pageBreakBefore w:val="0"/>
+              <w:widowControl w:val="0"/>
+              <w:spacing w:line="240" w:lineRule="auto"/>
+              <w:rPr/>
+            </w:pPr>
+            <w:r>
+              <w:rPr>
+                <w:rtl w:val="0"/>
+              </w:rPr>
+            </w:r>
+          </w:p>
+          <w:p>
+            <w:pPr>
+              <w:pageBreakBefore w:val="0"/>
+              <w:widowControl w:val="0"/>
+              <w:spacing w:line="240" w:lineRule="auto"/>
+              <w:rPr>
+                <w:b w:val="1"/>
+              </w:rPr>
+            </w:pPr>
+            <w:r>
+              <w:rPr>
+                <w:b w:val="1"/>
+                <w:rtl w:val="0"/>
+              </w:rPr>
+              <w:t xml:space="preserve">Testing:</w:t>
+            </w:r>
+          </w:p>
+          <w:p>
+            <w:pPr>
+              <w:pageBreakBefore w:val="0"/>
+              <w:widowControl w:val="0"/>
+              <w:spacing w:line="240" w:lineRule="auto"/>
+              <w:rPr/>
+            </w:pPr>
+            <w:r>
+              <w:rPr>
+                <w:rtl w:val="0"/>
+              </w:rPr>
+              <w:t xml:space="preserve">Verify proper display, update, and protection of dashboard setting across user sessions</w:t>
             </w:r>
           </w:p>
         </w:tc>
@@ -16827,12 +17219,12 @@
           <wp:inline distB="114300" distT="114300" distL="114300" distR="114300">
             <wp:extent cx="5247335" cy="2519363"/>
             <wp:effectExtent b="0" l="0" r="0" t="0"/>
-            <wp:docPr id="4" name="image5.png"/>
+            <wp:docPr id="4" name="image2.png"/>
             <a:graphic>
               <a:graphicData uri="http://schemas.openxmlformats.org/drawingml/2006/picture">
                 <pic:pic>
                   <pic:nvPicPr>
-                    <pic:cNvPr id="0" name="image5.png"/>
+                    <pic:cNvPr id="0" name="image2.png"/>
                     <pic:cNvPicPr preferRelativeResize="0"/>
                   </pic:nvPicPr>
                   <pic:blipFill>
@@ -16929,12 +17321,12 @@
           <wp:inline distB="114300" distT="114300" distL="114300" distR="114300">
             <wp:extent cx="4952426" cy="3262313"/>
             <wp:effectExtent b="0" l="0" r="0" t="0"/>
-            <wp:docPr id="2" name="image2.png"/>
+            <wp:docPr id="2" name="image1.png"/>
             <a:graphic>
               <a:graphicData uri="http://schemas.openxmlformats.org/drawingml/2006/picture">
                 <pic:pic>
                   <pic:nvPicPr>
-                    <pic:cNvPr id="0" name="image2.png"/>
+                    <pic:cNvPr id="0" name="image1.png"/>
                     <pic:cNvPicPr preferRelativeResize="0"/>
                   </pic:nvPicPr>
                   <pic:blipFill>
@@ -17058,12 +17450,12 @@
           <wp:inline distB="114300" distT="114300" distL="114300" distR="114300">
             <wp:extent cx="4957763" cy="3276351"/>
             <wp:effectExtent b="0" l="0" r="0" t="0"/>
-            <wp:docPr id="6" name="image4.png"/>
+            <wp:docPr id="6" name="image3.png"/>
             <a:graphic>
               <a:graphicData uri="http://schemas.openxmlformats.org/drawingml/2006/picture">
                 <pic:pic>
                   <pic:nvPicPr>
-                    <pic:cNvPr id="0" name="image4.png"/>
+                    <pic:cNvPr id="0" name="image3.png"/>
                     <pic:cNvPicPr preferRelativeResize="0"/>
                   </pic:nvPicPr>
                   <pic:blipFill>
@@ -17159,12 +17551,12 @@
           <wp:inline distB="114300" distT="114300" distL="114300" distR="114300">
             <wp:extent cx="6504754" cy="2328863"/>
             <wp:effectExtent b="0" l="0" r="0" t="0"/>
-            <wp:docPr id="5" name="image3.png"/>
+            <wp:docPr id="5" name="image4.png"/>
             <a:graphic>
               <a:graphicData uri="http://schemas.openxmlformats.org/drawingml/2006/picture">
                 <pic:pic>
                   <pic:nvPicPr>
-                    <pic:cNvPr id="0" name="image3.png"/>
+                    <pic:cNvPr id="0" name="image4.png"/>
                     <pic:cNvPicPr preferRelativeResize="0"/>
                   </pic:nvPicPr>
                   <pic:blipFill>
@@ -17271,12 +17663,12 @@
           <wp:inline distB="114300" distT="114300" distL="114300" distR="114300">
             <wp:extent cx="5616990" cy="3709988"/>
             <wp:effectExtent b="0" l="0" r="0" t="0"/>
-            <wp:docPr id="3" name="image6.png"/>
+            <wp:docPr id="3" name="image5.png"/>
             <a:graphic>
               <a:graphicData uri="http://schemas.openxmlformats.org/drawingml/2006/picture">
                 <pic:pic>
                   <pic:nvPicPr>
-                    <pic:cNvPr id="0" name="image6.png"/>
+                    <pic:cNvPr id="0" name="image5.png"/>
                     <pic:cNvPicPr preferRelativeResize="0"/>
                   </pic:nvPicPr>
                   <pic:blipFill>

</xml_diff>